<commit_message>
updates to report_gen hyperlinks and fig caps
</commit_message>
<xml_diff>
--- a/report_generation/template.docx
+++ b/report_generation/template.docx
@@ -2,15 +2,21 @@
 <file path=word/document.xml><?xml version="1.0" encoding="utf-8"?>
 <w:document xmlns:wpc="http://schemas.microsoft.com/office/word/2010/wordprocessingCanvas" xmlns:cx="http://schemas.microsoft.com/office/drawing/2014/chartex" xmlns:cx1="http://schemas.microsoft.com/office/drawing/2015/9/8/chartex" xmlns:cx2="http://schemas.microsoft.com/office/drawing/2015/10/21/chartex" xmlns:cx3="http://schemas.microsoft.com/office/drawing/2016/5/9/chartex" xmlns:cx4="http://schemas.microsoft.com/office/drawing/2016/5/10/chartex" xmlns:cx5="http://schemas.microsoft.com/office/drawing/2016/5/11/chartex" xmlns:cx6="http://schemas.microsoft.com/office/drawing/2016/5/12/chartex" xmlns:cx7="http://schemas.microsoft.com/office/drawing/2016/5/13/chartex" xmlns:cx8="http://schemas.microsoft.com/office/drawing/2016/5/14/chartex" xmlns:mc="http://schemas.openxmlformats.org/markup-compatibility/2006" xmlns:aink="http://schemas.microsoft.com/office/drawing/2016/ink" xmlns:am3d="http://schemas.microsoft.com/office/drawing/2017/model3d" xmlns:o="urn:schemas-microsoft-com:office:office" xmlns:oel="http://schemas.microsoft.com/office/2019/extlst" xmlns:r="http://schemas.openxmlformats.org/officeDocument/2006/relationships" xmlns:m="http://schemas.openxmlformats.org/officeDocument/2006/math" xmlns:v="urn:schemas-microsoft-com:vml" xmlns:wp14="http://schemas.microsoft.com/office/word/2010/wordprocessingDrawing" xmlns:wp="http://schemas.openxmlformats.org/drawingml/2006/wordprocessingDrawing" xmlns:w10="urn:schemas-microsoft-com:office:word" xmlns:w="http://schemas.openxmlformats.org/wordprocessingml/2006/main" xmlns:w14="http://schemas.microsoft.com/office/word/2010/wordml" xmlns:w15="http://schemas.microsoft.com/office/word/2012/wordml" xmlns:w16cex="http://schemas.microsoft.com/office/word/2018/wordml/cex" xmlns:w16cid="http://schemas.microsoft.com/office/word/2016/wordml/cid" xmlns:w16="http://schemas.microsoft.com/office/word/2018/wordml" xmlns:w16du="http://schemas.microsoft.com/office/word/2023/wordml/word16du" xmlns:w16sdtdh="http://schemas.microsoft.com/office/word/2020/wordml/sdtdatahash" xmlns:w16sdtfl="http://schemas.microsoft.com/office/word/2024/wordml/sdtformatlock" xmlns:w16se="http://schemas.microsoft.com/office/word/2015/wordml/symex" xmlns:wpg="http://schemas.microsoft.com/office/word/2010/wordprocessingGroup" xmlns:wpi="http://schemas.microsoft.com/office/word/2010/wordprocessingInk" xmlns:wne="http://schemas.microsoft.com/office/word/2006/wordml" xmlns:wps="http://schemas.microsoft.com/office/word/2010/wordprocessingShape" mc:Ignorable="w14 w15 w16se w16cid w16 w16cex w16sdtdh w16sdtfl w16du wp14">
   <w:body>
-    <w:p/>
+    <w:p>
+      <w:pPr>
+        <w:tabs>
+          <w:tab w:val="left" w:pos="8780"/>
+        </w:tabs>
+      </w:pPr>
+    </w:p>
     <w:sectPr>
-      <w:footerReference w:type="default" r:id="rId6"/>
-      <w:headerReference w:type="first" r:id="rId7"/>
-      <w:footerReference w:type="first" r:id="rId8"/>
+      <w:headerReference w:type="default" r:id="rId6"/>
+      <w:footerReference w:type="default" r:id="rId7"/>
+      <w:headerReference w:type="first" r:id="rId8"/>
+      <w:footerReference w:type="first" r:id="rId9"/>
       <w:pgSz w:w="12240" w:h="15840"/>
       <w:pgMar w:top="720" w:right="720" w:bottom="720" w:left="720" w:header="720" w:footer="720" w:gutter="0"/>
       <w:cols w:space="720"/>
-      <w:titlePg/>
       <w:docGrid w:linePitch="360"/>
     </w:sectPr>
   </w:body>
@@ -77,6 +83,23 @@
           <w:sz w:val="20"/>
           <w:szCs w:val="22"/>
         </w:rPr>
+        <w:t>alyssa.n.daigle@des.nh.gov</w:t>
+      </w:r>
+    </w:hyperlink>
+    <w:r>
+      <w:rPr>
+        <w:sz w:val="20"/>
+        <w:szCs w:val="22"/>
+      </w:rPr>
+      <w:t xml:space="preserve"> | </w:t>
+    </w:r>
+    <w:hyperlink r:id="rId3" w:history="1">
+      <w:r>
+        <w:rPr>
+          <w:rStyle w:val="Hyperlink"/>
+          <w:sz w:val="20"/>
+          <w:szCs w:val="22"/>
+        </w:rPr>
         <w:t>(603) 271-2658</w:t>
       </w:r>
     </w:hyperlink>
@@ -110,9 +133,30 @@
         <w:sz w:val="20"/>
         <w:szCs w:val="22"/>
       </w:rPr>
-      <w:t xml:space="preserve"> (VLAP) | </w:t>
+      <w:t xml:space="preserve"> (VLAP) </w:t>
+    </w:r>
+    <w:r>
+      <w:t xml:space="preserve">| </w:t>
     </w:r>
     <w:hyperlink r:id="rId2" w:history="1">
+      <w:r>
+        <w:rPr>
+          <w:rStyle w:val="Hyperlink"/>
+        </w:rPr>
+        <w:t>alyssa.n.daigle@des.nh.gov</w:t>
+      </w:r>
+    </w:hyperlink>
+    <w:r>
+      <w:t xml:space="preserve"> </w:t>
+    </w:r>
+    <w:r>
+      <w:rPr>
+        <w:sz w:val="20"/>
+        <w:szCs w:val="22"/>
+      </w:rPr>
+      <w:t xml:space="preserve">| </w:t>
+    </w:r>
+    <w:hyperlink r:id="rId3" w:history="1">
       <w:r>
         <w:rPr>
           <w:rStyle w:val="Hyperlink"/>
@@ -152,6 +196,104 @@
 </file>
 
 <file path=word/header1.xml><?xml version="1.0" encoding="utf-8"?>
+<w:hdr xmlns:wpc="http://schemas.microsoft.com/office/word/2010/wordprocessingCanvas" xmlns:cx="http://schemas.microsoft.com/office/drawing/2014/chartex" xmlns:cx1="http://schemas.microsoft.com/office/drawing/2015/9/8/chartex" xmlns:cx2="http://schemas.microsoft.com/office/drawing/2015/10/21/chartex" xmlns:cx3="http://schemas.microsoft.com/office/drawing/2016/5/9/chartex" xmlns:cx4="http://schemas.microsoft.com/office/drawing/2016/5/10/chartex" xmlns:cx5="http://schemas.microsoft.com/office/drawing/2016/5/11/chartex" xmlns:cx6="http://schemas.microsoft.com/office/drawing/2016/5/12/chartex" xmlns:cx7="http://schemas.microsoft.com/office/drawing/2016/5/13/chartex" xmlns:cx8="http://schemas.microsoft.com/office/drawing/2016/5/14/chartex" xmlns:mc="http://schemas.openxmlformats.org/markup-compatibility/2006" xmlns:aink="http://schemas.microsoft.com/office/drawing/2016/ink" xmlns:am3d="http://schemas.microsoft.com/office/drawing/2017/model3d" xmlns:o="urn:schemas-microsoft-com:office:office" xmlns:oel="http://schemas.microsoft.com/office/2019/extlst" xmlns:r="http://schemas.openxmlformats.org/officeDocument/2006/relationships" xmlns:m="http://schemas.openxmlformats.org/officeDocument/2006/math" xmlns:v="urn:schemas-microsoft-com:vml" xmlns:wp14="http://schemas.microsoft.com/office/word/2010/wordprocessingDrawing" xmlns:wp="http://schemas.openxmlformats.org/drawingml/2006/wordprocessingDrawing" xmlns:w10="urn:schemas-microsoft-com:office:word" xmlns:w="http://schemas.openxmlformats.org/wordprocessingml/2006/main" xmlns:w14="http://schemas.microsoft.com/office/word/2010/wordml" xmlns:w15="http://schemas.microsoft.com/office/word/2012/wordml" xmlns:w16cex="http://schemas.microsoft.com/office/word/2018/wordml/cex" xmlns:w16cid="http://schemas.microsoft.com/office/word/2016/wordml/cid" xmlns:w16="http://schemas.microsoft.com/office/word/2018/wordml" xmlns:w16du="http://schemas.microsoft.com/office/word/2023/wordml/word16du" xmlns:w16sdtdh="http://schemas.microsoft.com/office/word/2020/wordml/sdtdatahash" xmlns:w16sdtfl="http://schemas.microsoft.com/office/word/2024/wordml/sdtformatlock" xmlns:w16se="http://schemas.microsoft.com/office/word/2015/wordml/symex" xmlns:wpg="http://schemas.microsoft.com/office/word/2010/wordprocessingGroup" xmlns:wpi="http://schemas.microsoft.com/office/word/2010/wordprocessingInk" xmlns:wne="http://schemas.microsoft.com/office/word/2006/wordml" xmlns:wps="http://schemas.microsoft.com/office/word/2010/wordprocessingShape" mc:Ignorable="w14 w15 w16se w16cid w16 w16cex w16sdtdh w16sdtfl w16du wp14">
+  <w:p>
+    <w:pPr>
+      <w:pStyle w:val="Header"/>
+      <w:spacing w:line="480" w:lineRule="auto"/>
+      <w:jc w:val="right"/>
+    </w:pPr>
+    <w:r>
+      <w:rPr>
+        <w:smallCaps/>
+        <w:noProof/>
+        <w:sz w:val="36"/>
+        <w:szCs w:val="44"/>
+      </w:rPr>
+      <w:drawing>
+        <wp:anchor distT="0" distB="0" distL="114300" distR="114300" simplePos="0" relativeHeight="251661312" behindDoc="1" locked="0" layoutInCell="1" allowOverlap="1" wp14:anchorId="2122B718" wp14:editId="080ECF04">
+          <wp:simplePos x="0" y="0"/>
+          <wp:positionH relativeFrom="column">
+            <wp:posOffset>-11430</wp:posOffset>
+          </wp:positionH>
+          <wp:positionV relativeFrom="paragraph">
+            <wp:posOffset>-293076</wp:posOffset>
+          </wp:positionV>
+          <wp:extent cx="800100" cy="502920"/>
+          <wp:effectExtent l="0" t="0" r="0" b="0"/>
+          <wp:wrapTight wrapText="bothSides">
+            <wp:wrapPolygon edited="0">
+              <wp:start x="3600" y="0"/>
+              <wp:lineTo x="0" y="5727"/>
+              <wp:lineTo x="0" y="17182"/>
+              <wp:lineTo x="1029" y="20455"/>
+              <wp:lineTo x="14400" y="20455"/>
+              <wp:lineTo x="21086" y="14727"/>
+              <wp:lineTo x="21086" y="9818"/>
+              <wp:lineTo x="11314" y="0"/>
+              <wp:lineTo x="3600" y="0"/>
+            </wp:wrapPolygon>
+          </wp:wrapTight>
+          <wp:docPr id="1268430764" name="DES logo" descr="Logo of the New Hampshire Department of Environmental Services or NHDES."/>
+          <wp:cNvGraphicFramePr>
+            <a:graphicFrameLocks xmlns:a="http://schemas.openxmlformats.org/drawingml/2006/main" noChangeAspect="1"/>
+          </wp:cNvGraphicFramePr>
+          <a:graphic xmlns:a="http://schemas.openxmlformats.org/drawingml/2006/main">
+            <a:graphicData uri="http://schemas.openxmlformats.org/drawingml/2006/picture">
+              <pic:pic xmlns:pic="http://schemas.openxmlformats.org/drawingml/2006/picture">
+                <pic:nvPicPr>
+                  <pic:cNvPr id="8" name="DES logo" descr="Logo of the New Hampshire Department of Environmental Services or NHDES."/>
+                  <pic:cNvPicPr>
+                    <a:picLocks noChangeAspect="1"/>
+                  </pic:cNvPicPr>
+                </pic:nvPicPr>
+                <pic:blipFill>
+                  <a:blip r:embed="rId1" cstate="print">
+                    <a:extLst>
+                      <a:ext uri="{28A0092B-C50C-407E-A947-70E740481C1C}">
+                        <a14:useLocalDpi xmlns:a14="http://schemas.microsoft.com/office/drawing/2010/main" val="0"/>
+                      </a:ext>
+                    </a:extLst>
+                  </a:blip>
+                  <a:srcRect/>
+                  <a:stretch>
+                    <a:fillRect/>
+                  </a:stretch>
+                </pic:blipFill>
+                <pic:spPr bwMode="auto">
+                  <a:xfrm>
+                    <a:off x="0" y="0"/>
+                    <a:ext cx="800100" cy="502920"/>
+                  </a:xfrm>
+                  <a:prstGeom prst="rect">
+                    <a:avLst/>
+                  </a:prstGeom>
+                  <a:noFill/>
+                  <a:ln>
+                    <a:noFill/>
+                  </a:ln>
+                  <a:effectLst/>
+                </pic:spPr>
+              </pic:pic>
+            </a:graphicData>
+          </a:graphic>
+          <wp14:sizeRelH relativeFrom="page">
+            <wp14:pctWidth>0</wp14:pctWidth>
+          </wp14:sizeRelH>
+          <wp14:sizeRelV relativeFrom="page">
+            <wp14:pctHeight>0</wp14:pctHeight>
+          </wp14:sizeRelV>
+        </wp:anchor>
+      </w:drawing>
+    </w:r>
+    <w:r>
+      <w:t>LM-</w:t>
+    </w:r>
+  </w:p>
+</w:hdr>
+</file>
+
+<file path=word/header2.xml><?xml version="1.0" encoding="utf-8"?>
 <w:hdr xmlns:wpc="http://schemas.microsoft.com/office/word/2010/wordprocessingCanvas" xmlns:cx="http://schemas.microsoft.com/office/drawing/2014/chartex" xmlns:cx1="http://schemas.microsoft.com/office/drawing/2015/9/8/chartex" xmlns:cx2="http://schemas.microsoft.com/office/drawing/2015/10/21/chartex" xmlns:cx3="http://schemas.microsoft.com/office/drawing/2016/5/9/chartex" xmlns:cx4="http://schemas.microsoft.com/office/drawing/2016/5/10/chartex" xmlns:cx5="http://schemas.microsoft.com/office/drawing/2016/5/11/chartex" xmlns:cx6="http://schemas.microsoft.com/office/drawing/2016/5/12/chartex" xmlns:cx7="http://schemas.microsoft.com/office/drawing/2016/5/13/chartex" xmlns:cx8="http://schemas.microsoft.com/office/drawing/2016/5/14/chartex" xmlns:mc="http://schemas.openxmlformats.org/markup-compatibility/2006" xmlns:aink="http://schemas.microsoft.com/office/drawing/2016/ink" xmlns:am3d="http://schemas.microsoft.com/office/drawing/2017/model3d" xmlns:o="urn:schemas-microsoft-com:office:office" xmlns:oel="http://schemas.microsoft.com/office/2019/extlst" xmlns:r="http://schemas.openxmlformats.org/officeDocument/2006/relationships" xmlns:m="http://schemas.openxmlformats.org/officeDocument/2006/math" xmlns:v="urn:schemas-microsoft-com:vml" xmlns:wp14="http://schemas.microsoft.com/office/word/2010/wordprocessingDrawing" xmlns:wp="http://schemas.openxmlformats.org/drawingml/2006/wordprocessingDrawing" xmlns:w10="urn:schemas-microsoft-com:office:word" xmlns:w="http://schemas.openxmlformats.org/wordprocessingml/2006/main" xmlns:w14="http://schemas.microsoft.com/office/word/2010/wordml" xmlns:w15="http://schemas.microsoft.com/office/word/2012/wordml" xmlns:w16cex="http://schemas.microsoft.com/office/word/2018/wordml/cex" xmlns:w16cid="http://schemas.microsoft.com/office/word/2016/wordml/cid" xmlns:w16="http://schemas.microsoft.com/office/word/2018/wordml" xmlns:w16du="http://schemas.microsoft.com/office/word/2023/wordml/word16du" xmlns:w16sdtdh="http://schemas.microsoft.com/office/word/2020/wordml/sdtdatahash" xmlns:w16sdtfl="http://schemas.microsoft.com/office/word/2024/wordml/sdtformatlock" xmlns:w16se="http://schemas.microsoft.com/office/word/2015/wordml/symex" xmlns:wpg="http://schemas.microsoft.com/office/word/2010/wordprocessingGroup" xmlns:wpi="http://schemas.microsoft.com/office/word/2010/wordprocessingInk" xmlns:wne="http://schemas.microsoft.com/office/word/2006/wordml" xmlns:wps="http://schemas.microsoft.com/office/word/2010/wordprocessingShape" mc:Ignorable="w14 w15 w16se w16cid w16 w16cex w16sdtdh w16sdtfl w16du wp14">
   <w:p>
     <w:pPr>
@@ -1217,7 +1359,7 @@
     <w:unhideWhenUsed/>
     <w:rsid w:val="004B7480"/>
     <w:rPr>
-      <w:color w:val="467886" w:themeColor="hyperlink"/>
+      <w:color w:val="0000FF" w:themeColor="hyperlink"/>
       <w:u w:val="single"/>
     </w:rPr>
   </w:style>
@@ -1284,13 +1426,25 @@
       <w:u w:val="single"/>
     </w:rPr>
   </w:style>
+  <w:style w:type="character" w:styleId="UnresolvedMention">
+    <w:name w:val="Unresolved Mention"/>
+    <w:basedOn w:val="DefaultParagraphFont"/>
+    <w:uiPriority w:val="99"/>
+    <w:semiHidden/>
+    <w:unhideWhenUsed/>
+    <w:rsid w:val="008F2F4B"/>
+    <w:rPr>
+      <w:color w:val="605E5C"/>
+      <w:shd w:val="clear" w:color="auto" w:fill="E1DFDD"/>
+    </w:rPr>
+  </w:style>
 </w:styles>
 </file>
 
 <file path=word/theme/theme1.xml><?xml version="1.0" encoding="utf-8"?>
 <a:theme xmlns:a="http://schemas.openxmlformats.org/drawingml/2006/main" name="Office Theme">
   <a:themeElements>
-    <a:clrScheme name="Office">
+    <a:clrScheme name="Custom 9">
       <a:dk1>
         <a:sysClr val="windowText" lastClr="000000"/>
       </a:dk1>
@@ -1322,7 +1476,7 @@
         <a:srgbClr val="4EA72E"/>
       </a:accent6>
       <a:hlink>
-        <a:srgbClr val="467886"/>
+        <a:srgbClr val="0000FF"/>
       </a:hlink>
       <a:folHlink>
         <a:srgbClr val="96607D"/>

</xml_diff>

<commit_message>
added LM and metadata
</commit_message>
<xml_diff>
--- a/report_generation/template.docx
+++ b/report_generation/template.docx
@@ -8,10 +8,12 @@
       </w:pPr>
     </w:p>
     <w:sectPr>
-      <w:headerReference w:type="default" r:id="rId6"/>
-      <w:footerReference w:type="default" r:id="rId7"/>
-      <w:headerReference w:type="first" r:id="rId8"/>
-      <w:footerReference w:type="first" r:id="rId9"/>
+      <w:headerReference w:type="even" r:id="rId6"/>
+      <w:headerReference w:type="default" r:id="rId7"/>
+      <w:footerReference w:type="even" r:id="rId8"/>
+      <w:footerReference w:type="default" r:id="rId9"/>
+      <w:headerReference w:type="first" r:id="rId10"/>
+      <w:footerReference w:type="first" r:id="rId11"/>
       <w:pgSz w:w="12240" w:h="15840"/>
       <w:pgMar w:top="720" w:right="720" w:bottom="720" w:left="720" w:header="720" w:footer="720" w:gutter="0"/>
       <w:cols w:space="720"/>
@@ -47,6 +49,16 @@
 </file>
 
 <file path=word/footer1.xml><?xml version="1.0" encoding="utf-8"?>
+<w:ftr xmlns:wpc="http://schemas.microsoft.com/office/word/2010/wordprocessingCanvas" xmlns:cx="http://schemas.microsoft.com/office/drawing/2014/chartex" xmlns:cx1="http://schemas.microsoft.com/office/drawing/2015/9/8/chartex" xmlns:cx2="http://schemas.microsoft.com/office/drawing/2015/10/21/chartex" xmlns:cx3="http://schemas.microsoft.com/office/drawing/2016/5/9/chartex" xmlns:cx4="http://schemas.microsoft.com/office/drawing/2016/5/10/chartex" xmlns:cx5="http://schemas.microsoft.com/office/drawing/2016/5/11/chartex" xmlns:cx6="http://schemas.microsoft.com/office/drawing/2016/5/12/chartex" xmlns:cx7="http://schemas.microsoft.com/office/drawing/2016/5/13/chartex" xmlns:cx8="http://schemas.microsoft.com/office/drawing/2016/5/14/chartex" xmlns:mc="http://schemas.openxmlformats.org/markup-compatibility/2006" xmlns:aink="http://schemas.microsoft.com/office/drawing/2016/ink" xmlns:am3d="http://schemas.microsoft.com/office/drawing/2017/model3d" xmlns:o="urn:schemas-microsoft-com:office:office" xmlns:oel="http://schemas.microsoft.com/office/2019/extlst" xmlns:r="http://schemas.openxmlformats.org/officeDocument/2006/relationships" xmlns:m="http://schemas.openxmlformats.org/officeDocument/2006/math" xmlns:v="urn:schemas-microsoft-com:vml" xmlns:wp14="http://schemas.microsoft.com/office/word/2010/wordprocessingDrawing" xmlns:wp="http://schemas.openxmlformats.org/drawingml/2006/wordprocessingDrawing" xmlns:w10="urn:schemas-microsoft-com:office:word" xmlns:w="http://schemas.openxmlformats.org/wordprocessingml/2006/main" xmlns:w14="http://schemas.microsoft.com/office/word/2010/wordml" xmlns:w15="http://schemas.microsoft.com/office/word/2012/wordml" xmlns:w16cex="http://schemas.microsoft.com/office/word/2018/wordml/cex" xmlns:w16cid="http://schemas.microsoft.com/office/word/2016/wordml/cid" xmlns:w16="http://schemas.microsoft.com/office/word/2018/wordml" xmlns:w16du="http://schemas.microsoft.com/office/word/2023/wordml/word16du" xmlns:w16sdtdh="http://schemas.microsoft.com/office/word/2020/wordml/sdtdatahash" xmlns:w16sdtfl="http://schemas.microsoft.com/office/word/2024/wordml/sdtformatlock" xmlns:w16se="http://schemas.microsoft.com/office/word/2015/wordml/symex" xmlns:wpg="http://schemas.microsoft.com/office/word/2010/wordprocessingGroup" xmlns:wpi="http://schemas.microsoft.com/office/word/2010/wordprocessingInk" xmlns:wne="http://schemas.microsoft.com/office/word/2006/wordml" xmlns:wps="http://schemas.microsoft.com/office/word/2010/wordprocessingShape" mc:Ignorable="w14 w15 w16se w16cid w16 w16cex w16sdtdh w16sdtfl w16du wp14">
+  <w:p>
+    <w:pPr>
+      <w:pStyle w:val="Footer"/>
+    </w:pPr>
+  </w:p>
+</w:ftr>
+</file>
+
+<file path=word/footer2.xml><?xml version="1.0" encoding="utf-8"?>
 <w:ftr xmlns:wpc="http://schemas.microsoft.com/office/word/2010/wordprocessingCanvas" xmlns:cx="http://schemas.microsoft.com/office/drawing/2014/chartex" xmlns:cx1="http://schemas.microsoft.com/office/drawing/2015/9/8/chartex" xmlns:cx2="http://schemas.microsoft.com/office/drawing/2015/10/21/chartex" xmlns:cx3="http://schemas.microsoft.com/office/drawing/2016/5/9/chartex" xmlns:cx4="http://schemas.microsoft.com/office/drawing/2016/5/10/chartex" xmlns:cx5="http://schemas.microsoft.com/office/drawing/2016/5/11/chartex" xmlns:cx6="http://schemas.microsoft.com/office/drawing/2016/5/12/chartex" xmlns:cx7="http://schemas.microsoft.com/office/drawing/2016/5/13/chartex" xmlns:cx8="http://schemas.microsoft.com/office/drawing/2016/5/14/chartex" xmlns:mc="http://schemas.openxmlformats.org/markup-compatibility/2006" xmlns:aink="http://schemas.microsoft.com/office/drawing/2016/ink" xmlns:am3d="http://schemas.microsoft.com/office/drawing/2017/model3d" xmlns:o="urn:schemas-microsoft-com:office:office" xmlns:oel="http://schemas.microsoft.com/office/2019/extlst" xmlns:r="http://schemas.openxmlformats.org/officeDocument/2006/relationships" xmlns:m="http://schemas.openxmlformats.org/officeDocument/2006/math" xmlns:v="urn:schemas-microsoft-com:vml" xmlns:wp14="http://schemas.microsoft.com/office/word/2010/wordprocessingDrawing" xmlns:wp="http://schemas.openxmlformats.org/drawingml/2006/wordprocessingDrawing" xmlns:w10="urn:schemas-microsoft-com:office:word" xmlns:w="http://schemas.openxmlformats.org/wordprocessingml/2006/main" xmlns:w14="http://schemas.microsoft.com/office/word/2010/wordml" xmlns:w15="http://schemas.microsoft.com/office/word/2012/wordml" xmlns:w16cex="http://schemas.microsoft.com/office/word/2018/wordml/cex" xmlns:w16cid="http://schemas.microsoft.com/office/word/2016/wordml/cid" xmlns:w16="http://schemas.microsoft.com/office/word/2018/wordml" xmlns:w16du="http://schemas.microsoft.com/office/word/2023/wordml/word16du" xmlns:w16sdtdh="http://schemas.microsoft.com/office/word/2020/wordml/sdtdatahash" xmlns:w16sdtfl="http://schemas.microsoft.com/office/word/2024/wordml/sdtformatlock" xmlns:w16se="http://schemas.microsoft.com/office/word/2015/wordml/symex" xmlns:wpg="http://schemas.microsoft.com/office/word/2010/wordprocessingGroup" xmlns:wpi="http://schemas.microsoft.com/office/word/2010/wordprocessingInk" xmlns:wne="http://schemas.microsoft.com/office/word/2006/wordml" xmlns:wps="http://schemas.microsoft.com/office/word/2010/wordprocessingShape" mc:Ignorable="w14 w15 w16se w16cid w16 w16cex w16sdtdh w16sdtfl w16du wp14">
   <w:p>
     <w:pPr>
@@ -105,7 +117,7 @@
 </w:ftr>
 </file>
 
-<file path=word/footer2.xml><?xml version="1.0" encoding="utf-8"?>
+<file path=word/footer3.xml><?xml version="1.0" encoding="utf-8"?>
 <w:ftr xmlns:wpc="http://schemas.microsoft.com/office/word/2010/wordprocessingCanvas" xmlns:cx="http://schemas.microsoft.com/office/drawing/2014/chartex" xmlns:cx1="http://schemas.microsoft.com/office/drawing/2015/9/8/chartex" xmlns:cx2="http://schemas.microsoft.com/office/drawing/2015/10/21/chartex" xmlns:cx3="http://schemas.microsoft.com/office/drawing/2016/5/9/chartex" xmlns:cx4="http://schemas.microsoft.com/office/drawing/2016/5/10/chartex" xmlns:cx5="http://schemas.microsoft.com/office/drawing/2016/5/11/chartex" xmlns:cx6="http://schemas.microsoft.com/office/drawing/2016/5/12/chartex" xmlns:cx7="http://schemas.microsoft.com/office/drawing/2016/5/13/chartex" xmlns:cx8="http://schemas.microsoft.com/office/drawing/2016/5/14/chartex" xmlns:mc="http://schemas.openxmlformats.org/markup-compatibility/2006" xmlns:aink="http://schemas.microsoft.com/office/drawing/2016/ink" xmlns:am3d="http://schemas.microsoft.com/office/drawing/2017/model3d" xmlns:o="urn:schemas-microsoft-com:office:office" xmlns:oel="http://schemas.microsoft.com/office/2019/extlst" xmlns:r="http://schemas.openxmlformats.org/officeDocument/2006/relationships" xmlns:m="http://schemas.openxmlformats.org/officeDocument/2006/math" xmlns:v="urn:schemas-microsoft-com:vml" xmlns:wp14="http://schemas.microsoft.com/office/word/2010/wordprocessingDrawing" xmlns:wp="http://schemas.openxmlformats.org/drawingml/2006/wordprocessingDrawing" xmlns:w10="urn:schemas-microsoft-com:office:word" xmlns:w="http://schemas.openxmlformats.org/wordprocessingml/2006/main" xmlns:w14="http://schemas.microsoft.com/office/word/2010/wordml" xmlns:w15="http://schemas.microsoft.com/office/word/2012/wordml" xmlns:w16cex="http://schemas.microsoft.com/office/word/2018/wordml/cex" xmlns:w16cid="http://schemas.microsoft.com/office/word/2016/wordml/cid" xmlns:w16="http://schemas.microsoft.com/office/word/2018/wordml" xmlns:w16du="http://schemas.microsoft.com/office/word/2023/wordml/word16du" xmlns:w16sdtdh="http://schemas.microsoft.com/office/word/2020/wordml/sdtdatahash" xmlns:w16sdtfl="http://schemas.microsoft.com/office/word/2024/wordml/sdtformatlock" xmlns:w16se="http://schemas.microsoft.com/office/word/2015/wordml/symex" xmlns:wpg="http://schemas.microsoft.com/office/word/2010/wordprocessingGroup" xmlns:wpi="http://schemas.microsoft.com/office/word/2010/wordprocessingInk" xmlns:wne="http://schemas.microsoft.com/office/word/2006/wordml" xmlns:wps="http://schemas.microsoft.com/office/word/2010/wordprocessingShape" mc:Ignorable="w14 w15 w16se w16cid w16 w16cex w16sdtdh w16sdtfl w16du wp14">
   <w:p>
     <w:pPr>
@@ -194,6 +206,16 @@
 </file>
 
 <file path=word/header1.xml><?xml version="1.0" encoding="utf-8"?>
+<w:hdr xmlns:wpc="http://schemas.microsoft.com/office/word/2010/wordprocessingCanvas" xmlns:cx="http://schemas.microsoft.com/office/drawing/2014/chartex" xmlns:cx1="http://schemas.microsoft.com/office/drawing/2015/9/8/chartex" xmlns:cx2="http://schemas.microsoft.com/office/drawing/2015/10/21/chartex" xmlns:cx3="http://schemas.microsoft.com/office/drawing/2016/5/9/chartex" xmlns:cx4="http://schemas.microsoft.com/office/drawing/2016/5/10/chartex" xmlns:cx5="http://schemas.microsoft.com/office/drawing/2016/5/11/chartex" xmlns:cx6="http://schemas.microsoft.com/office/drawing/2016/5/12/chartex" xmlns:cx7="http://schemas.microsoft.com/office/drawing/2016/5/13/chartex" xmlns:cx8="http://schemas.microsoft.com/office/drawing/2016/5/14/chartex" xmlns:mc="http://schemas.openxmlformats.org/markup-compatibility/2006" xmlns:aink="http://schemas.microsoft.com/office/drawing/2016/ink" xmlns:am3d="http://schemas.microsoft.com/office/drawing/2017/model3d" xmlns:o="urn:schemas-microsoft-com:office:office" xmlns:oel="http://schemas.microsoft.com/office/2019/extlst" xmlns:r="http://schemas.openxmlformats.org/officeDocument/2006/relationships" xmlns:m="http://schemas.openxmlformats.org/officeDocument/2006/math" xmlns:v="urn:schemas-microsoft-com:vml" xmlns:wp14="http://schemas.microsoft.com/office/word/2010/wordprocessingDrawing" xmlns:wp="http://schemas.openxmlformats.org/drawingml/2006/wordprocessingDrawing" xmlns:w10="urn:schemas-microsoft-com:office:word" xmlns:w="http://schemas.openxmlformats.org/wordprocessingml/2006/main" xmlns:w14="http://schemas.microsoft.com/office/word/2010/wordml" xmlns:w15="http://schemas.microsoft.com/office/word/2012/wordml" xmlns:w16cex="http://schemas.microsoft.com/office/word/2018/wordml/cex" xmlns:w16cid="http://schemas.microsoft.com/office/word/2016/wordml/cid" xmlns:w16="http://schemas.microsoft.com/office/word/2018/wordml" xmlns:w16du="http://schemas.microsoft.com/office/word/2023/wordml/word16du" xmlns:w16sdtdh="http://schemas.microsoft.com/office/word/2020/wordml/sdtdatahash" xmlns:w16sdtfl="http://schemas.microsoft.com/office/word/2024/wordml/sdtformatlock" xmlns:w16se="http://schemas.microsoft.com/office/word/2015/wordml/symex" xmlns:wpg="http://schemas.microsoft.com/office/word/2010/wordprocessingGroup" xmlns:wpi="http://schemas.microsoft.com/office/word/2010/wordprocessingInk" xmlns:wne="http://schemas.microsoft.com/office/word/2006/wordml" xmlns:wps="http://schemas.microsoft.com/office/word/2010/wordprocessingShape" mc:Ignorable="w14 w15 w16se w16cid w16 w16cex w16sdtdh w16sdtfl w16du wp14">
+  <w:p>
+    <w:pPr>
+      <w:pStyle w:val="Header"/>
+    </w:pPr>
+  </w:p>
+</w:hdr>
+</file>
+
+<file path=word/header2.xml><?xml version="1.0" encoding="utf-8"?>
 <w:hdr xmlns:wpc="http://schemas.microsoft.com/office/word/2010/wordprocessingCanvas" xmlns:cx="http://schemas.microsoft.com/office/drawing/2014/chartex" xmlns:cx1="http://schemas.microsoft.com/office/drawing/2015/9/8/chartex" xmlns:cx2="http://schemas.microsoft.com/office/drawing/2015/10/21/chartex" xmlns:cx3="http://schemas.microsoft.com/office/drawing/2016/5/9/chartex" xmlns:cx4="http://schemas.microsoft.com/office/drawing/2016/5/10/chartex" xmlns:cx5="http://schemas.microsoft.com/office/drawing/2016/5/11/chartex" xmlns:cx6="http://schemas.microsoft.com/office/drawing/2016/5/12/chartex" xmlns:cx7="http://schemas.microsoft.com/office/drawing/2016/5/13/chartex" xmlns:cx8="http://schemas.microsoft.com/office/drawing/2016/5/14/chartex" xmlns:mc="http://schemas.openxmlformats.org/markup-compatibility/2006" xmlns:aink="http://schemas.microsoft.com/office/drawing/2016/ink" xmlns:am3d="http://schemas.microsoft.com/office/drawing/2017/model3d" xmlns:o="urn:schemas-microsoft-com:office:office" xmlns:oel="http://schemas.microsoft.com/office/2019/extlst" xmlns:r="http://schemas.openxmlformats.org/officeDocument/2006/relationships" xmlns:m="http://schemas.openxmlformats.org/officeDocument/2006/math" xmlns:v="urn:schemas-microsoft-com:vml" xmlns:wp14="http://schemas.microsoft.com/office/word/2010/wordprocessingDrawing" xmlns:wp="http://schemas.openxmlformats.org/drawingml/2006/wordprocessingDrawing" xmlns:w10="urn:schemas-microsoft-com:office:word" xmlns:w="http://schemas.openxmlformats.org/wordprocessingml/2006/main" xmlns:w14="http://schemas.microsoft.com/office/word/2010/wordml" xmlns:w15="http://schemas.microsoft.com/office/word/2012/wordml" xmlns:w16cex="http://schemas.microsoft.com/office/word/2018/wordml/cex" xmlns:w16cid="http://schemas.microsoft.com/office/word/2016/wordml/cid" xmlns:w16="http://schemas.microsoft.com/office/word/2018/wordml" xmlns:w16du="http://schemas.microsoft.com/office/word/2023/wordml/word16du" xmlns:w16sdtdh="http://schemas.microsoft.com/office/word/2020/wordml/sdtdatahash" xmlns:w16sdtfl="http://schemas.microsoft.com/office/word/2024/wordml/sdtformatlock" xmlns:w16se="http://schemas.microsoft.com/office/word/2015/wordml/symex" xmlns:wpg="http://schemas.microsoft.com/office/word/2010/wordprocessingGroup" xmlns:wpi="http://schemas.microsoft.com/office/word/2010/wordprocessingInk" xmlns:wne="http://schemas.microsoft.com/office/word/2006/wordml" xmlns:wps="http://schemas.microsoft.com/office/word/2010/wordprocessingShape" mc:Ignorable="w14 w15 w16se w16cid w16 w16cex w16sdtdh w16sdtfl w16du wp14">
   <w:p>
     <w:pPr>
@@ -285,13 +307,13 @@
       </w:drawing>
     </w:r>
     <w:r>
-      <w:t>LM-</w:t>
+      <w:t>&lt;&lt;pub&gt;&gt;</w:t>
     </w:r>
   </w:p>
 </w:hdr>
 </file>
 
-<file path=word/header2.xml><?xml version="1.0" encoding="utf-8"?>
+<file path=word/header3.xml><?xml version="1.0" encoding="utf-8"?>
 <w:hdr xmlns:wpc="http://schemas.microsoft.com/office/word/2010/wordprocessingCanvas" xmlns:cx="http://schemas.microsoft.com/office/drawing/2014/chartex" xmlns:cx1="http://schemas.microsoft.com/office/drawing/2015/9/8/chartex" xmlns:cx2="http://schemas.microsoft.com/office/drawing/2015/10/21/chartex" xmlns:cx3="http://schemas.microsoft.com/office/drawing/2016/5/9/chartex" xmlns:cx4="http://schemas.microsoft.com/office/drawing/2016/5/10/chartex" xmlns:cx5="http://schemas.microsoft.com/office/drawing/2016/5/11/chartex" xmlns:cx6="http://schemas.microsoft.com/office/drawing/2016/5/12/chartex" xmlns:cx7="http://schemas.microsoft.com/office/drawing/2016/5/13/chartex" xmlns:cx8="http://schemas.microsoft.com/office/drawing/2016/5/14/chartex" xmlns:mc="http://schemas.openxmlformats.org/markup-compatibility/2006" xmlns:aink="http://schemas.microsoft.com/office/drawing/2016/ink" xmlns:am3d="http://schemas.microsoft.com/office/drawing/2017/model3d" xmlns:o="urn:schemas-microsoft-com:office:office" xmlns:oel="http://schemas.microsoft.com/office/2019/extlst" xmlns:r="http://schemas.openxmlformats.org/officeDocument/2006/relationships" xmlns:m="http://schemas.openxmlformats.org/officeDocument/2006/math" xmlns:v="urn:schemas-microsoft-com:vml" xmlns:wp14="http://schemas.microsoft.com/office/word/2010/wordprocessingDrawing" xmlns:wp="http://schemas.openxmlformats.org/drawingml/2006/wordprocessingDrawing" xmlns:w10="urn:schemas-microsoft-com:office:word" xmlns:w="http://schemas.openxmlformats.org/wordprocessingml/2006/main" xmlns:w14="http://schemas.microsoft.com/office/word/2010/wordml" xmlns:w15="http://schemas.microsoft.com/office/word/2012/wordml" xmlns:w16cex="http://schemas.microsoft.com/office/word/2018/wordml/cex" xmlns:w16cid="http://schemas.microsoft.com/office/word/2016/wordml/cid" xmlns:w16="http://schemas.microsoft.com/office/word/2018/wordml" xmlns:w16du="http://schemas.microsoft.com/office/word/2023/wordml/word16du" xmlns:w16sdtdh="http://schemas.microsoft.com/office/word/2020/wordml/sdtdatahash" xmlns:w16sdtfl="http://schemas.microsoft.com/office/word/2024/wordml/sdtformatlock" xmlns:w16se="http://schemas.microsoft.com/office/word/2015/wordml/symex" xmlns:wpg="http://schemas.microsoft.com/office/word/2010/wordprocessingGroup" xmlns:wpi="http://schemas.microsoft.com/office/word/2010/wordprocessingInk" xmlns:wne="http://schemas.microsoft.com/office/word/2006/wordml" xmlns:wps="http://schemas.microsoft.com/office/word/2010/wordprocessingShape" mc:Ignorable="w14 w15 w16se w16cid w16 w16cex w16sdtdh w16sdtfl w16du wp14">
   <w:p>
     <w:pPr>

</xml_diff>

<commit_message>
updates logo, header, pic size, caption, trend table layout. still need to get fig captions right again
</commit_message>
<xml_diff>
--- a/report_generation/template.docx
+++ b/report_generation/template.docx
@@ -2,6 +2,11 @@
 <file path=word/document.xml><?xml version="1.0" encoding="utf-8"?>
 <w:document xmlns:wpc="http://schemas.microsoft.com/office/word/2010/wordprocessingCanvas" xmlns:cx="http://schemas.microsoft.com/office/drawing/2014/chartex" xmlns:cx1="http://schemas.microsoft.com/office/drawing/2015/9/8/chartex" xmlns:cx2="http://schemas.microsoft.com/office/drawing/2015/10/21/chartex" xmlns:cx3="http://schemas.microsoft.com/office/drawing/2016/5/9/chartex" xmlns:cx4="http://schemas.microsoft.com/office/drawing/2016/5/10/chartex" xmlns:cx5="http://schemas.microsoft.com/office/drawing/2016/5/11/chartex" xmlns:cx6="http://schemas.microsoft.com/office/drawing/2016/5/12/chartex" xmlns:cx7="http://schemas.microsoft.com/office/drawing/2016/5/13/chartex" xmlns:cx8="http://schemas.microsoft.com/office/drawing/2016/5/14/chartex" xmlns:mc="http://schemas.openxmlformats.org/markup-compatibility/2006" xmlns:aink="http://schemas.microsoft.com/office/drawing/2016/ink" xmlns:am3d="http://schemas.microsoft.com/office/drawing/2017/model3d" xmlns:o="urn:schemas-microsoft-com:office:office" xmlns:oel="http://schemas.microsoft.com/office/2019/extlst" xmlns:r="http://schemas.openxmlformats.org/officeDocument/2006/relationships" xmlns:m="http://schemas.openxmlformats.org/officeDocument/2006/math" xmlns:v="urn:schemas-microsoft-com:vml" xmlns:wp14="http://schemas.microsoft.com/office/word/2010/wordprocessingDrawing" xmlns:wp="http://schemas.openxmlformats.org/drawingml/2006/wordprocessingDrawing" xmlns:w10="urn:schemas-microsoft-com:office:word" xmlns:w="http://schemas.openxmlformats.org/wordprocessingml/2006/main" xmlns:w14="http://schemas.microsoft.com/office/word/2010/wordml" xmlns:w15="http://schemas.microsoft.com/office/word/2012/wordml" xmlns:w16cex="http://schemas.microsoft.com/office/word/2018/wordml/cex" xmlns:w16cid="http://schemas.microsoft.com/office/word/2016/wordml/cid" xmlns:w16="http://schemas.microsoft.com/office/word/2018/wordml" xmlns:w16du="http://schemas.microsoft.com/office/word/2023/wordml/word16du" xmlns:w16sdtdh="http://schemas.microsoft.com/office/word/2020/wordml/sdtdatahash" xmlns:w16sdtfl="http://schemas.microsoft.com/office/word/2024/wordml/sdtformatlock" xmlns:w16se="http://schemas.microsoft.com/office/word/2015/wordml/symex" xmlns:wpg="http://schemas.microsoft.com/office/word/2010/wordprocessingGroup" xmlns:wpi="http://schemas.microsoft.com/office/word/2010/wordprocessingInk" xmlns:wne="http://schemas.microsoft.com/office/word/2006/wordml" xmlns:wps="http://schemas.microsoft.com/office/word/2010/wordprocessingShape" mc:Ignorable="w14 w15 w16se w16cid w16 w16cex w16sdtdh w16sdtfl w16du wp14">
   <w:body>
+    <w:p>
+      <w:pPr>
+        <w:pStyle w:val="Title"/>
+      </w:pPr>
+    </w:p>
     <w:p>
       <w:pPr>
         <w:pStyle w:val="Heading2"/>
@@ -204,36 +209,38 @@
     </w:pPr>
     <w:r>
       <w:rPr>
-        <w:smallCaps/>
+        <w:rFonts w:eastAsiaTheme="majorEastAsia" w:cstheme="majorBidi"/>
+        <w:b/>
         <w:noProof/>
-        <w:sz w:val="36"/>
-        <w:szCs w:val="44"/>
+        <w:color w:val="156082" w:themeColor="accent1"/>
+        <w:sz w:val="30"/>
+        <w:szCs w:val="32"/>
       </w:rPr>
       <w:drawing>
-        <wp:anchor distT="0" distB="0" distL="114300" distR="114300" simplePos="0" relativeHeight="251661312" behindDoc="1" locked="0" layoutInCell="1" allowOverlap="1" wp14:anchorId="2122B718" wp14:editId="080ECF04">
+        <wp:anchor distT="0" distB="0" distL="114300" distR="114300" simplePos="0" relativeHeight="251660288" behindDoc="1" locked="0" layoutInCell="1" allowOverlap="1" wp14:anchorId="3CE5D4F8" wp14:editId="0A856107">
           <wp:simplePos x="0" y="0"/>
           <wp:positionH relativeFrom="column">
-            <wp:posOffset>-11430</wp:posOffset>
+            <wp:posOffset>-477</wp:posOffset>
           </wp:positionH>
           <wp:positionV relativeFrom="paragraph">
-            <wp:posOffset>-293076</wp:posOffset>
+            <wp:posOffset>-316230</wp:posOffset>
           </wp:positionV>
-          <wp:extent cx="800100" cy="502920"/>
+          <wp:extent cx="1094105" cy="573405"/>
           <wp:effectExtent l="0" t="0" r="0" b="0"/>
           <wp:wrapTight wrapText="bothSides">
             <wp:wrapPolygon edited="0">
-              <wp:start x="3600" y="0"/>
-              <wp:lineTo x="0" y="5727"/>
-              <wp:lineTo x="0" y="17182"/>
-              <wp:lineTo x="1029" y="20455"/>
-              <wp:lineTo x="14400" y="20455"/>
-              <wp:lineTo x="21086" y="14727"/>
-              <wp:lineTo x="21086" y="9818"/>
-              <wp:lineTo x="11314" y="0"/>
-              <wp:lineTo x="3600" y="0"/>
+              <wp:start x="3761" y="0"/>
+              <wp:lineTo x="0" y="4306"/>
+              <wp:lineTo x="0" y="15070"/>
+              <wp:lineTo x="1504" y="20811"/>
+              <wp:lineTo x="11283" y="20811"/>
+              <wp:lineTo x="21061" y="18658"/>
+              <wp:lineTo x="21061" y="5741"/>
+              <wp:lineTo x="8650" y="0"/>
+              <wp:lineTo x="3761" y="0"/>
             </wp:wrapPolygon>
           </wp:wrapTight>
-          <wp:docPr id="1268430764" name="DES logo" descr="Logo of the New Hampshire Department of Environmental Services or NHDES."/>
+          <wp:docPr id="1646606622" name="Picture 2"/>
           <wp:cNvGraphicFramePr>
             <a:graphicFrameLocks xmlns:a="http://schemas.openxmlformats.org/drawingml/2006/main" noChangeAspect="1"/>
           </wp:cNvGraphicFramePr>
@@ -241,13 +248,13 @@
             <a:graphicData uri="http://schemas.openxmlformats.org/drawingml/2006/picture">
               <pic:pic xmlns:pic="http://schemas.openxmlformats.org/drawingml/2006/picture">
                 <pic:nvPicPr>
-                  <pic:cNvPr id="8" name="DES logo" descr="Logo of the New Hampshire Department of Environmental Services or NHDES."/>
+                  <pic:cNvPr id="0" name="Picture 6"/>
                   <pic:cNvPicPr>
-                    <a:picLocks noChangeAspect="1"/>
+                    <a:picLocks noChangeAspect="1" noChangeArrowheads="1"/>
                   </pic:cNvPicPr>
                 </pic:nvPicPr>
                 <pic:blipFill>
-                  <a:blip r:embed="rId1" cstate="print">
+                  <a:blip r:embed="rId1">
                     <a:extLst>
                       <a:ext uri="{28A0092B-C50C-407E-A947-70E740481C1C}">
                         <a14:useLocalDpi xmlns:a14="http://schemas.microsoft.com/office/drawing/2010/main" val="0"/>
@@ -262,7 +269,7 @@
                 <pic:spPr bwMode="auto">
                   <a:xfrm>
                     <a:off x="0" y="0"/>
-                    <a:ext cx="800100" cy="502920"/>
+                    <a:ext cx="1094105" cy="573405"/>
                   </a:xfrm>
                   <a:prstGeom prst="rect">
                     <a:avLst/>
@@ -271,7 +278,6 @@
                   <a:ln>
                     <a:noFill/>
                   </a:ln>
-                  <a:effectLst/>
                 </pic:spPr>
               </pic:pic>
             </a:graphicData>
@@ -1144,9 +1150,10 @@
     <w:basedOn w:val="Normal"/>
     <w:next w:val="Normal"/>
     <w:link w:val="TitleChar"/>
+    <w:autoRedefine/>
     <w:uiPriority w:val="10"/>
     <w:qFormat/>
-    <w:rsid w:val="00367BED"/>
+    <w:rsid w:val="0090185E"/>
     <w:pPr>
       <w:spacing w:after="0"/>
       <w:contextualSpacing/>
@@ -1157,7 +1164,7 @@
       <w:b/>
       <w:spacing w:val="-10"/>
       <w:kern w:val="28"/>
-      <w:sz w:val="52"/>
+      <w:sz w:val="48"/>
       <w:szCs w:val="56"/>
     </w:rPr>
   </w:style>
@@ -1166,13 +1173,13 @@
     <w:basedOn w:val="DefaultParagraphFont"/>
     <w:link w:val="Title"/>
     <w:uiPriority w:val="10"/>
-    <w:rsid w:val="00367BED"/>
+    <w:rsid w:val="0090185E"/>
     <w:rPr>
       <w:rFonts w:eastAsiaTheme="majorEastAsia" w:cstheme="majorBidi"/>
       <w:b/>
       <w:spacing w:val="-10"/>
       <w:kern w:val="28"/>
-      <w:sz w:val="52"/>
+      <w:sz w:val="48"/>
       <w:szCs w:val="56"/>
     </w:rPr>
   </w:style>

</xml_diff>